<commit_message>
pdf y arreglar indice
</commit_message>
<xml_diff>
--- a/docs/BoxScout_Junior.docx
+++ b/docs/BoxScout_Junior.docx
@@ -91,7 +91,7 @@
           <w:r>
             <w:fldChar w:fldCharType="separate"/>
           </w:r>
-          <w:hyperlink w:anchor="_Toc243935292" w:history="1">
+          <w:hyperlink w:anchor="_Toc243945350" w:history="1">
             <w:r>
               <w:rPr>
                 <w:rStyle w:val="Hipervnculo"/>
@@ -118,7 +118,7 @@
                 <w:noProof/>
                 <w:webHidden/>
               </w:rPr>
-              <w:instrText xml:space="preserve"> PAGEREF _Toc243935292 \h </w:instrText>
+              <w:instrText xml:space="preserve"> PAGEREF _Toc243945350 \h </w:instrText>
             </w:r>
             <w:r>
               <w:rPr>
@@ -138,7 +138,7 @@
                 <w:noProof/>
                 <w:webHidden/>
               </w:rPr>
-              <w:t>3</w:t>
+              <w:t>4</w:t>
             </w:r>
             <w:r>
               <w:rPr>
@@ -165,7 +165,7 @@
               <w14:ligatures w14:val="standardContextual"/>
             </w:rPr>
           </w:pPr>
-          <w:hyperlink w:anchor="_Toc243935293" w:history="1">
+          <w:hyperlink w:anchor="_Toc243945351" w:history="1">
             <w:r>
               <w:rPr>
                 <w:rStyle w:val="Hipervnculo"/>
@@ -192,7 +192,7 @@
                 <w:noProof/>
                 <w:webHidden/>
               </w:rPr>
-              <w:instrText xml:space="preserve"> PAGEREF _Toc243935293 \h </w:instrText>
+              <w:instrText xml:space="preserve"> PAGEREF _Toc243945351 \h </w:instrText>
             </w:r>
             <w:r>
               <w:rPr>
@@ -212,7 +212,7 @@
                 <w:noProof/>
                 <w:webHidden/>
               </w:rPr>
-              <w:t>3</w:t>
+              <w:t>4</w:t>
             </w:r>
             <w:r>
               <w:rPr>
@@ -239,7 +239,7 @@
               <w14:ligatures w14:val="standardContextual"/>
             </w:rPr>
           </w:pPr>
-          <w:hyperlink w:anchor="_Toc243935294" w:history="1">
+          <w:hyperlink w:anchor="_Toc243945352" w:history="1">
             <w:r>
               <w:rPr>
                 <w:rStyle w:val="Hipervnculo"/>
@@ -266,7 +266,7 @@
                 <w:noProof/>
                 <w:webHidden/>
               </w:rPr>
-              <w:instrText xml:space="preserve"> PAGEREF _Toc243935294 \h </w:instrText>
+              <w:instrText xml:space="preserve"> PAGEREF _Toc243945352 \h </w:instrText>
             </w:r>
             <w:r>
               <w:rPr>
@@ -286,7 +286,7 @@
                 <w:noProof/>
                 <w:webHidden/>
               </w:rPr>
-              <w:t>4</w:t>
+              <w:t>5</w:t>
             </w:r>
             <w:r>
               <w:rPr>
@@ -313,7 +313,7 @@
               <w14:ligatures w14:val="standardContextual"/>
             </w:rPr>
           </w:pPr>
-          <w:hyperlink w:anchor="_Toc243935295" w:history="1">
+          <w:hyperlink w:anchor="_Toc243945353" w:history="1">
             <w:r>
               <w:rPr>
                 <w:rStyle w:val="Hipervnculo"/>
@@ -340,7 +340,7 @@
                 <w:noProof/>
                 <w:webHidden/>
               </w:rPr>
-              <w:instrText xml:space="preserve"> PAGEREF _Toc243935295 \h </w:instrText>
+              <w:instrText xml:space="preserve"> PAGEREF _Toc243945353 \h </w:instrText>
             </w:r>
             <w:r>
               <w:rPr>
@@ -360,7 +360,7 @@
                 <w:noProof/>
                 <w:webHidden/>
               </w:rPr>
-              <w:t>4</w:t>
+              <w:t>5</w:t>
             </w:r>
             <w:r>
               <w:rPr>
@@ -387,7 +387,7 @@
               <w14:ligatures w14:val="standardContextual"/>
             </w:rPr>
           </w:pPr>
-          <w:hyperlink w:anchor="_Toc243935296" w:history="1">
+          <w:hyperlink w:anchor="_Toc243945354" w:history="1">
             <w:r>
               <w:rPr>
                 <w:rStyle w:val="Hipervnculo"/>
@@ -414,7 +414,7 @@
                 <w:noProof/>
                 <w:webHidden/>
               </w:rPr>
-              <w:instrText xml:space="preserve"> PAGEREF _Toc243935296 \h </w:instrText>
+              <w:instrText xml:space="preserve"> PAGEREF _Toc243945354 \h </w:instrText>
             </w:r>
             <w:r>
               <w:rPr>
@@ -434,7 +434,7 @@
                 <w:noProof/>
                 <w:webHidden/>
               </w:rPr>
-              <w:t>4</w:t>
+              <w:t>5</w:t>
             </w:r>
             <w:r>
               <w:rPr>
@@ -461,7 +461,7 @@
               <w14:ligatures w14:val="standardContextual"/>
             </w:rPr>
           </w:pPr>
-          <w:hyperlink w:anchor="_Toc243935297" w:history="1">
+          <w:hyperlink w:anchor="_Toc243945355" w:history="1">
             <w:r>
               <w:rPr>
                 <w:rStyle w:val="Hipervnculo"/>
@@ -488,7 +488,7 @@
                 <w:noProof/>
                 <w:webHidden/>
               </w:rPr>
-              <w:instrText xml:space="preserve"> PAGEREF _Toc243935297 \h </w:instrText>
+              <w:instrText xml:space="preserve"> PAGEREF _Toc243945355 \h </w:instrText>
             </w:r>
             <w:r>
               <w:rPr>
@@ -508,7 +508,7 @@
                 <w:noProof/>
                 <w:webHidden/>
               </w:rPr>
-              <w:t>5</w:t>
+              <w:t>6</w:t>
             </w:r>
             <w:r>
               <w:rPr>
@@ -535,7 +535,7 @@
               <w14:ligatures w14:val="standardContextual"/>
             </w:rPr>
           </w:pPr>
-          <w:hyperlink w:anchor="_Toc243935298" w:history="1">
+          <w:hyperlink w:anchor="_Toc243945356" w:history="1">
             <w:r>
               <w:rPr>
                 <w:rStyle w:val="Hipervnculo"/>
@@ -562,7 +562,7 @@
                 <w:noProof/>
                 <w:webHidden/>
               </w:rPr>
-              <w:instrText xml:space="preserve"> PAGEREF _Toc243935298 \h </w:instrText>
+              <w:instrText xml:space="preserve"> PAGEREF _Toc243945356 \h </w:instrText>
             </w:r>
             <w:r>
               <w:rPr>
@@ -582,7 +582,7 @@
                 <w:noProof/>
                 <w:webHidden/>
               </w:rPr>
-              <w:t>6</w:t>
+              <w:t>7</w:t>
             </w:r>
             <w:r>
               <w:rPr>
@@ -609,7 +609,7 @@
               <w14:ligatures w14:val="standardContextual"/>
             </w:rPr>
           </w:pPr>
-          <w:hyperlink w:anchor="_Toc243935299" w:history="1">
+          <w:hyperlink w:anchor="_Toc243945357" w:history="1">
             <w:r>
               <w:rPr>
                 <w:rStyle w:val="Hipervnculo"/>
@@ -636,7 +636,7 @@
                 <w:noProof/>
                 <w:webHidden/>
               </w:rPr>
-              <w:instrText xml:space="preserve"> PAGEREF _Toc243935299 \h </w:instrText>
+              <w:instrText xml:space="preserve"> PAGEREF _Toc243945357 \h </w:instrText>
             </w:r>
             <w:r>
               <w:rPr>
@@ -656,7 +656,7 @@
                 <w:noProof/>
                 <w:webHidden/>
               </w:rPr>
-              <w:t>6</w:t>
+              <w:t>7</w:t>
             </w:r>
             <w:r>
               <w:rPr>
@@ -683,7 +683,7 @@
               <w14:ligatures w14:val="standardContextual"/>
             </w:rPr>
           </w:pPr>
-          <w:hyperlink w:anchor="_Toc243935300" w:history="1">
+          <w:hyperlink w:anchor="_Toc243945358" w:history="1">
             <w:r>
               <w:rPr>
                 <w:rStyle w:val="Hipervnculo"/>
@@ -710,7 +710,7 @@
                 <w:noProof/>
                 <w:webHidden/>
               </w:rPr>
-              <w:instrText xml:space="preserve"> PAGEREF _Toc243935300 \h </w:instrText>
+              <w:instrText xml:space="preserve"> PAGEREF _Toc243945358 \h </w:instrText>
             </w:r>
             <w:r>
               <w:rPr>
@@ -730,7 +730,7 @@
                 <w:noProof/>
                 <w:webHidden/>
               </w:rPr>
-              <w:t>7</w:t>
+              <w:t>8</w:t>
             </w:r>
             <w:r>
               <w:rPr>
@@ -757,7 +757,7 @@
               <w14:ligatures w14:val="standardContextual"/>
             </w:rPr>
           </w:pPr>
-          <w:hyperlink w:anchor="_Toc243935301" w:history="1">
+          <w:hyperlink w:anchor="_Toc243945359" w:history="1">
             <w:r>
               <w:rPr>
                 <w:rStyle w:val="Hipervnculo"/>
@@ -784,7 +784,7 @@
                 <w:noProof/>
                 <w:webHidden/>
               </w:rPr>
-              <w:instrText xml:space="preserve"> PAGEREF _Toc243935301 \h </w:instrText>
+              <w:instrText xml:space="preserve"> PAGEREF _Toc243945359 \h </w:instrText>
             </w:r>
             <w:r>
               <w:rPr>
@@ -804,7 +804,7 @@
                 <w:noProof/>
                 <w:webHidden/>
               </w:rPr>
-              <w:t>7</w:t>
+              <w:t>8</w:t>
             </w:r>
             <w:r>
               <w:rPr>
@@ -831,7 +831,7 @@
               <w14:ligatures w14:val="standardContextual"/>
             </w:rPr>
           </w:pPr>
-          <w:hyperlink w:anchor="_Toc243935302" w:history="1">
+          <w:hyperlink w:anchor="_Toc243945360" w:history="1">
             <w:r>
               <w:rPr>
                 <w:rStyle w:val="Hipervnculo"/>
@@ -858,7 +858,7 @@
                 <w:noProof/>
                 <w:webHidden/>
               </w:rPr>
-              <w:instrText xml:space="preserve"> PAGEREF _Toc243935302 \h </w:instrText>
+              <w:instrText xml:space="preserve"> PAGEREF _Toc243945360 \h </w:instrText>
             </w:r>
             <w:r>
               <w:rPr>
@@ -878,7 +878,7 @@
                 <w:noProof/>
                 <w:webHidden/>
               </w:rPr>
-              <w:t>7</w:t>
+              <w:t>8</w:t>
             </w:r>
             <w:r>
               <w:rPr>
@@ -905,7 +905,7 @@
               <w14:ligatures w14:val="standardContextual"/>
             </w:rPr>
           </w:pPr>
-          <w:hyperlink w:anchor="_Toc243935303" w:history="1">
+          <w:hyperlink w:anchor="_Toc243945361" w:history="1">
             <w:r>
               <w:rPr>
                 <w:rStyle w:val="Hipervnculo"/>
@@ -932,7 +932,7 @@
                 <w:noProof/>
                 <w:webHidden/>
               </w:rPr>
-              <w:instrText xml:space="preserve"> PAGEREF _Toc243935303 \h </w:instrText>
+              <w:instrText xml:space="preserve"> PAGEREF _Toc243945361 \h </w:instrText>
             </w:r>
             <w:r>
               <w:rPr>
@@ -952,7 +952,7 @@
                 <w:noProof/>
                 <w:webHidden/>
               </w:rPr>
-              <w:t>8</w:t>
+              <w:t>9</w:t>
             </w:r>
             <w:r>
               <w:rPr>
@@ -979,7 +979,7 @@
               <w14:ligatures w14:val="standardContextual"/>
             </w:rPr>
           </w:pPr>
-          <w:hyperlink w:anchor="_Toc243935304" w:history="1">
+          <w:hyperlink w:anchor="_Toc243945362" w:history="1">
             <w:r>
               <w:rPr>
                 <w:rStyle w:val="Hipervnculo"/>
@@ -1006,7 +1006,7 @@
                 <w:noProof/>
                 <w:webHidden/>
               </w:rPr>
-              <w:instrText xml:space="preserve"> PAGEREF _Toc243935304 \h </w:instrText>
+              <w:instrText xml:space="preserve"> PAGEREF _Toc243945362 \h </w:instrText>
             </w:r>
             <w:r>
               <w:rPr>
@@ -1026,7 +1026,7 @@
                 <w:noProof/>
                 <w:webHidden/>
               </w:rPr>
-              <w:t>8</w:t>
+              <w:t>9</w:t>
             </w:r>
             <w:r>
               <w:rPr>
@@ -1053,7 +1053,7 @@
               <w14:ligatures w14:val="standardContextual"/>
             </w:rPr>
           </w:pPr>
-          <w:hyperlink w:anchor="_Toc243935305" w:history="1">
+          <w:hyperlink w:anchor="_Toc243945363" w:history="1">
             <w:r>
               <w:rPr>
                 <w:rStyle w:val="Hipervnculo"/>
@@ -1080,7 +1080,7 @@
                 <w:noProof/>
                 <w:webHidden/>
               </w:rPr>
-              <w:instrText xml:space="preserve"> PAGEREF _Toc243935305 \h </w:instrText>
+              <w:instrText xml:space="preserve"> PAGEREF _Toc243945363 \h </w:instrText>
             </w:r>
             <w:r>
               <w:rPr>
@@ -1100,7 +1100,7 @@
                 <w:noProof/>
                 <w:webHidden/>
               </w:rPr>
-              <w:t>8</w:t>
+              <w:t>9</w:t>
             </w:r>
             <w:r>
               <w:rPr>
@@ -1127,7 +1127,7 @@
               <w14:ligatures w14:val="standardContextual"/>
             </w:rPr>
           </w:pPr>
-          <w:hyperlink w:anchor="_Toc243935306" w:history="1">
+          <w:hyperlink w:anchor="_Toc243945364" w:history="1">
             <w:r>
               <w:rPr>
                 <w:rStyle w:val="Hipervnculo"/>
@@ -1154,7 +1154,7 @@
                 <w:noProof/>
                 <w:webHidden/>
               </w:rPr>
-              <w:instrText xml:space="preserve"> PAGEREF _Toc243935306 \h </w:instrText>
+              <w:instrText xml:space="preserve"> PAGEREF _Toc243945364 \h </w:instrText>
             </w:r>
             <w:r>
               <w:rPr>
@@ -1174,7 +1174,7 @@
                 <w:noProof/>
                 <w:webHidden/>
               </w:rPr>
-              <w:t>9</w:t>
+              <w:t>10</w:t>
             </w:r>
             <w:r>
               <w:rPr>
@@ -1201,7 +1201,7 @@
               <w14:ligatures w14:val="standardContextual"/>
             </w:rPr>
           </w:pPr>
-          <w:hyperlink w:anchor="_Toc243935307" w:history="1">
+          <w:hyperlink w:anchor="_Toc243945365" w:history="1">
             <w:r>
               <w:rPr>
                 <w:rStyle w:val="Hipervnculo"/>
@@ -1228,7 +1228,7 @@
                 <w:noProof/>
                 <w:webHidden/>
               </w:rPr>
-              <w:instrText xml:space="preserve"> PAGEREF _Toc243935307 \h </w:instrText>
+              <w:instrText xml:space="preserve"> PAGEREF _Toc243945365 \h </w:instrText>
             </w:r>
             <w:r>
               <w:rPr>
@@ -1248,7 +1248,7 @@
                 <w:noProof/>
                 <w:webHidden/>
               </w:rPr>
-              <w:t>10</w:t>
+              <w:t>11</w:t>
             </w:r>
             <w:r>
               <w:rPr>
@@ -1275,7 +1275,7 @@
               <w14:ligatures w14:val="standardContextual"/>
             </w:rPr>
           </w:pPr>
-          <w:hyperlink w:anchor="_Toc243935308" w:history="1">
+          <w:hyperlink w:anchor="_Toc243945366" w:history="1">
             <w:r>
               <w:rPr>
                 <w:rStyle w:val="Hipervnculo"/>
@@ -1302,7 +1302,7 @@
                 <w:noProof/>
                 <w:webHidden/>
               </w:rPr>
-              <w:instrText xml:space="preserve"> PAGEREF _Toc243935308 \h </w:instrText>
+              <w:instrText xml:space="preserve"> PAGEREF _Toc243945366 \h </w:instrText>
             </w:r>
             <w:r>
               <w:rPr>
@@ -1322,7 +1322,7 @@
                 <w:noProof/>
                 <w:webHidden/>
               </w:rPr>
-              <w:t>11</w:t>
+              <w:t>12</w:t>
             </w:r>
             <w:r>
               <w:rPr>
@@ -1349,7 +1349,7 @@
               <w14:ligatures w14:val="standardContextual"/>
             </w:rPr>
           </w:pPr>
-          <w:hyperlink w:anchor="_Toc243935309" w:history="1">
+          <w:hyperlink w:anchor="_Toc243945367" w:history="1">
             <w:r>
               <w:rPr>
                 <w:rStyle w:val="Hipervnculo"/>
@@ -1376,7 +1376,7 @@
                 <w:noProof/>
                 <w:webHidden/>
               </w:rPr>
-              <w:instrText xml:space="preserve"> PAGEREF _Toc243935309 \h </w:instrText>
+              <w:instrText xml:space="preserve"> PAGEREF _Toc243945367 \h </w:instrText>
             </w:r>
             <w:r>
               <w:rPr>
@@ -1396,7 +1396,7 @@
                 <w:noProof/>
                 <w:webHidden/>
               </w:rPr>
-              <w:t>12</w:t>
+              <w:t>13</w:t>
             </w:r>
             <w:r>
               <w:rPr>
@@ -1423,7 +1423,7 @@
               <w14:ligatures w14:val="standardContextual"/>
             </w:rPr>
           </w:pPr>
-          <w:hyperlink w:anchor="_Toc243935310" w:history="1">
+          <w:hyperlink w:anchor="_Toc243945368" w:history="1">
             <w:r>
               <w:rPr>
                 <w:rStyle w:val="Hipervnculo"/>
@@ -1450,7 +1450,7 @@
                 <w:noProof/>
                 <w:webHidden/>
               </w:rPr>
-              <w:instrText xml:space="preserve"> PAGEREF _Toc243935310 \h </w:instrText>
+              <w:instrText xml:space="preserve"> PAGEREF _Toc243945368 \h </w:instrText>
             </w:r>
             <w:r>
               <w:rPr>
@@ -1470,7 +1470,7 @@
                 <w:noProof/>
                 <w:webHidden/>
               </w:rPr>
-              <w:t>13</w:t>
+              <w:t>14</w:t>
             </w:r>
             <w:r>
               <w:rPr>
@@ -1497,7 +1497,7 @@
               <w14:ligatures w14:val="standardContextual"/>
             </w:rPr>
           </w:pPr>
-          <w:hyperlink w:anchor="_Toc243935311" w:history="1">
+          <w:hyperlink w:anchor="_Toc243945369" w:history="1">
             <w:r>
               <w:rPr>
                 <w:rStyle w:val="Hipervnculo"/>
@@ -1524,7 +1524,7 @@
                 <w:noProof/>
                 <w:webHidden/>
               </w:rPr>
-              <w:instrText xml:space="preserve"> PAGEREF _Toc243935311 \h </w:instrText>
+              <w:instrText xml:space="preserve"> PAGEREF _Toc243945369 \h </w:instrText>
             </w:r>
             <w:r>
               <w:rPr>
@@ -1544,7 +1544,81 @@
                 <w:noProof/>
                 <w:webHidden/>
               </w:rPr>
-              <w:t>14</w:t>
+              <w:t>15</w:t>
+            </w:r>
+            <w:r>
+              <w:rPr>
+                <w:noProof/>
+                <w:webHidden/>
+              </w:rPr>
+              <w:fldChar w:fldCharType="end"/>
+            </w:r>
+          </w:hyperlink>
+        </w:p>
+        <w:p>
+          <w:pPr>
+            <w:pStyle w:val="TDC1"/>
+            <w:tabs>
+              <w:tab w:val="right" w:leader="dot" w:pos="9350"/>
+            </w:tabs>
+            <w:rPr>
+              <w:rFonts w:eastAsiaTheme="minorEastAsia"/>
+              <w:noProof/>
+              <w:kern w:val="2"/>
+              <w:sz w:val="24"/>
+              <w:szCs w:val="24"/>
+              <w:lang w:val="es-ES" w:eastAsia="es-ES"/>
+              <w14:ligatures w14:val="standardContextual"/>
+            </w:rPr>
+          </w:pPr>
+          <w:hyperlink w:anchor="_Toc243945370" w:history="1">
+            <w:r>
+              <w:rPr>
+                <w:rStyle w:val="Hipervnculo"/>
+                <w:noProof/>
+              </w:rPr>
+              <w:t>Index Optimization</w:t>
+            </w:r>
+            <w:r>
+              <w:rPr>
+                <w:noProof/>
+                <w:webHidden/>
+              </w:rPr>
+              <w:tab/>
+            </w:r>
+            <w:r>
+              <w:rPr>
+                <w:noProof/>
+                <w:webHidden/>
+              </w:rPr>
+              <w:fldChar w:fldCharType="begin"/>
+            </w:r>
+            <w:r>
+              <w:rPr>
+                <w:noProof/>
+                <w:webHidden/>
+              </w:rPr>
+              <w:instrText xml:space="preserve"> PAGEREF _Toc243945370 \h </w:instrText>
+            </w:r>
+            <w:r>
+              <w:rPr>
+                <w:noProof/>
+                <w:webHidden/>
+              </w:rPr>
+            </w:r>
+            <w:r>
+              <w:rPr>
+                <w:noProof/>
+                <w:webHidden/>
+              </w:rPr>
+              <w:fldChar w:fldCharType="separate"/>
+            </w:r>
+            <w:r>
+              <w:rPr>
+                <w:noProof/>
+                <w:webHidden/>
+              </w:rPr>
+              <w:t>16</w:t>
             </w:r>
             <w:r>
               <w:rPr>
@@ -1571,27 +1645,161 @@
               <w14:ligatures w14:val="standardContextual"/>
             </w:rPr>
           </w:pPr>
-          <w:hyperlink w:anchor="_Toc243935312" w:history="1">
+          <w:hyperlink w:anchor="_Toc243945371" w:history="1">
             <w:r>
               <w:rPr>
                 <w:rStyle w:val="Hipervnculo"/>
                 <w:noProof/>
               </w:rPr>
-              <w:t>Index</w:t>
-            </w:r>
+              <w:t>Preparar tabla de pruebas</w:t>
+            </w:r>
+            <w:r>
+              <w:rPr>
+                <w:noProof/>
+                <w:webHidden/>
+              </w:rPr>
+              <w:tab/>
+            </w:r>
+            <w:r>
+              <w:rPr>
+                <w:noProof/>
+                <w:webHidden/>
+              </w:rPr>
+              <w:fldChar w:fldCharType="begin"/>
+            </w:r>
+            <w:r>
+              <w:rPr>
+                <w:noProof/>
+                <w:webHidden/>
+              </w:rPr>
+              <w:instrText xml:space="preserve"> PAGEREF _Toc243945371 \h </w:instrText>
+            </w:r>
+            <w:r>
+              <w:rPr>
+                <w:noProof/>
+                <w:webHidden/>
+              </w:rPr>
+            </w:r>
+            <w:r>
+              <w:rPr>
+                <w:noProof/>
+                <w:webHidden/>
+              </w:rPr>
+              <w:fldChar w:fldCharType="separate"/>
+            </w:r>
+            <w:r>
+              <w:rPr>
+                <w:noProof/>
+                <w:webHidden/>
+              </w:rPr>
+              <w:t>16</w:t>
+            </w:r>
+            <w:r>
+              <w:rPr>
+                <w:noProof/>
+                <w:webHidden/>
+              </w:rPr>
+              <w:fldChar w:fldCharType="end"/>
+            </w:r>
+          </w:hyperlink>
+        </w:p>
+        <w:p>
+          <w:pPr>
+            <w:pStyle w:val="TDC2"/>
+            <w:tabs>
+              <w:tab w:val="right" w:leader="dot" w:pos="9350"/>
+            </w:tabs>
+            <w:rPr>
+              <w:rFonts w:eastAsiaTheme="minorEastAsia"/>
+              <w:noProof/>
+              <w:kern w:val="2"/>
+              <w:sz w:val="24"/>
+              <w:szCs w:val="24"/>
+              <w:lang w:val="es-ES" w:eastAsia="es-ES"/>
+              <w14:ligatures w14:val="standardContextual"/>
+            </w:rPr>
+          </w:pPr>
+          <w:hyperlink w:anchor="_Toc243945372" w:history="1">
             <w:r>
               <w:rPr>
                 <w:rStyle w:val="Hipervnculo"/>
                 <w:noProof/>
               </w:rPr>
-              <w:t xml:space="preserve"> </w:t>
-            </w:r>
+              <w:t>Búsqueda sin Optimizar</w:t>
+            </w:r>
+            <w:r>
+              <w:rPr>
+                <w:noProof/>
+                <w:webHidden/>
+              </w:rPr>
+              <w:tab/>
+            </w:r>
+            <w:r>
+              <w:rPr>
+                <w:noProof/>
+                <w:webHidden/>
+              </w:rPr>
+              <w:fldChar w:fldCharType="begin"/>
+            </w:r>
+            <w:r>
+              <w:rPr>
+                <w:noProof/>
+                <w:webHidden/>
+              </w:rPr>
+              <w:instrText xml:space="preserve"> PAGEREF _Toc243945372 \h </w:instrText>
+            </w:r>
+            <w:r>
+              <w:rPr>
+                <w:noProof/>
+                <w:webHidden/>
+              </w:rPr>
+            </w:r>
+            <w:r>
+              <w:rPr>
+                <w:noProof/>
+                <w:webHidden/>
+              </w:rPr>
+              <w:fldChar w:fldCharType="separate"/>
+            </w:r>
+            <w:r>
+              <w:rPr>
+                <w:noProof/>
+                <w:webHidden/>
+              </w:rPr>
+              <w:t>17</w:t>
+            </w:r>
+            <w:r>
+              <w:rPr>
+                <w:noProof/>
+                <w:webHidden/>
+              </w:rPr>
+              <w:fldChar w:fldCharType="end"/>
+            </w:r>
+          </w:hyperlink>
+        </w:p>
+        <w:p>
+          <w:pPr>
+            <w:pStyle w:val="TDC2"/>
+            <w:tabs>
+              <w:tab w:val="right" w:leader="dot" w:pos="9350"/>
+            </w:tabs>
+            <w:rPr>
+              <w:rFonts w:eastAsiaTheme="minorEastAsia"/>
+              <w:noProof/>
+              <w:kern w:val="2"/>
+              <w:sz w:val="24"/>
+              <w:szCs w:val="24"/>
+              <w:lang w:val="es-ES" w:eastAsia="es-ES"/>
+              <w14:ligatures w14:val="standardContextual"/>
+            </w:rPr>
+          </w:pPr>
+          <w:hyperlink w:anchor="_Toc243945373" w:history="1">
             <w:r>
               <w:rPr>
                 <w:rStyle w:val="Hipervnculo"/>
                 <w:noProof/>
               </w:rPr>
-              <w:t>Optimization</w:t>
+              <w:t>Búsqueda Optimizada</w:t>
             </w:r>
             <w:r>
               <w:rPr>
@@ -1612,7 +1820,7 @@
                 <w:noProof/>
                 <w:webHidden/>
               </w:rPr>
-              <w:instrText xml:space="preserve"> PAGEREF _Toc243935312 \h </w:instrText>
+              <w:instrText xml:space="preserve"> PAGEREF _Toc243945373 \h </w:instrText>
             </w:r>
             <w:r>
               <w:rPr>
@@ -1632,7 +1840,599 @@
                 <w:noProof/>
                 <w:webHidden/>
               </w:rPr>
-              <w:t>15</w:t>
+              <w:t>18</w:t>
+            </w:r>
+            <w:r>
+              <w:rPr>
+                <w:noProof/>
+                <w:webHidden/>
+              </w:rPr>
+              <w:fldChar w:fldCharType="end"/>
+            </w:r>
+          </w:hyperlink>
+        </w:p>
+        <w:p>
+          <w:pPr>
+            <w:pStyle w:val="TDC1"/>
+            <w:tabs>
+              <w:tab w:val="right" w:leader="dot" w:pos="9350"/>
+            </w:tabs>
+            <w:rPr>
+              <w:rFonts w:eastAsiaTheme="minorEastAsia"/>
+              <w:noProof/>
+              <w:kern w:val="2"/>
+              <w:sz w:val="24"/>
+              <w:szCs w:val="24"/>
+              <w:lang w:val="es-ES" w:eastAsia="es-ES"/>
+              <w14:ligatures w14:val="standardContextual"/>
+            </w:rPr>
+          </w:pPr>
+          <w:hyperlink w:anchor="_Toc243945374" w:history="1">
+            <w:r>
+              <w:rPr>
+                <w:rStyle w:val="Hipervnculo"/>
+                <w:noProof/>
+              </w:rPr>
+              <w:t>Modelos, embeddings y búsqueda inteligente</w:t>
+            </w:r>
+            <w:r>
+              <w:rPr>
+                <w:noProof/>
+                <w:webHidden/>
+              </w:rPr>
+              <w:tab/>
+            </w:r>
+            <w:r>
+              <w:rPr>
+                <w:noProof/>
+                <w:webHidden/>
+              </w:rPr>
+              <w:fldChar w:fldCharType="begin"/>
+            </w:r>
+            <w:r>
+              <w:rPr>
+                <w:noProof/>
+                <w:webHidden/>
+              </w:rPr>
+              <w:instrText xml:space="preserve"> PAGEREF _Toc243945374 \h </w:instrText>
+            </w:r>
+            <w:r>
+              <w:rPr>
+                <w:noProof/>
+                <w:webHidden/>
+              </w:rPr>
+            </w:r>
+            <w:r>
+              <w:rPr>
+                <w:noProof/>
+                <w:webHidden/>
+              </w:rPr>
+              <w:fldChar w:fldCharType="separate"/>
+            </w:r>
+            <w:r>
+              <w:rPr>
+                <w:noProof/>
+                <w:webHidden/>
+              </w:rPr>
+              <w:t>19</w:t>
+            </w:r>
+            <w:r>
+              <w:rPr>
+                <w:noProof/>
+                <w:webHidden/>
+              </w:rPr>
+              <w:fldChar w:fldCharType="end"/>
+            </w:r>
+          </w:hyperlink>
+        </w:p>
+        <w:p>
+          <w:pPr>
+            <w:pStyle w:val="TDC2"/>
+            <w:tabs>
+              <w:tab w:val="right" w:leader="dot" w:pos="9350"/>
+            </w:tabs>
+            <w:rPr>
+              <w:rFonts w:eastAsiaTheme="minorEastAsia"/>
+              <w:noProof/>
+              <w:kern w:val="2"/>
+              <w:sz w:val="24"/>
+              <w:szCs w:val="24"/>
+              <w:lang w:val="es-ES" w:eastAsia="es-ES"/>
+              <w14:ligatures w14:val="standardContextual"/>
+            </w:rPr>
+          </w:pPr>
+          <w:hyperlink w:anchor="_Toc243945375" w:history="1">
+            <w:r>
+              <w:rPr>
+                <w:rStyle w:val="Hipervnculo"/>
+                <w:noProof/>
+              </w:rPr>
+              <w:t>Conectar SQL Server con el modelo</w:t>
+            </w:r>
+            <w:r>
+              <w:rPr>
+                <w:noProof/>
+                <w:webHidden/>
+              </w:rPr>
+              <w:tab/>
+            </w:r>
+            <w:r>
+              <w:rPr>
+                <w:noProof/>
+                <w:webHidden/>
+              </w:rPr>
+              <w:fldChar w:fldCharType="begin"/>
+            </w:r>
+            <w:r>
+              <w:rPr>
+                <w:noProof/>
+                <w:webHidden/>
+              </w:rPr>
+              <w:instrText xml:space="preserve"> PAGEREF _Toc243945375 \h </w:instrText>
+            </w:r>
+            <w:r>
+              <w:rPr>
+                <w:noProof/>
+                <w:webHidden/>
+              </w:rPr>
+            </w:r>
+            <w:r>
+              <w:rPr>
+                <w:noProof/>
+                <w:webHidden/>
+              </w:rPr>
+              <w:fldChar w:fldCharType="separate"/>
+            </w:r>
+            <w:r>
+              <w:rPr>
+                <w:noProof/>
+                <w:webHidden/>
+              </w:rPr>
+              <w:t>19</w:t>
+            </w:r>
+            <w:r>
+              <w:rPr>
+                <w:noProof/>
+                <w:webHidden/>
+              </w:rPr>
+              <w:fldChar w:fldCharType="end"/>
+            </w:r>
+          </w:hyperlink>
+        </w:p>
+        <w:p>
+          <w:pPr>
+            <w:pStyle w:val="TDC2"/>
+            <w:tabs>
+              <w:tab w:val="right" w:leader="dot" w:pos="9350"/>
+            </w:tabs>
+            <w:rPr>
+              <w:rFonts w:eastAsiaTheme="minorEastAsia"/>
+              <w:noProof/>
+              <w:kern w:val="2"/>
+              <w:sz w:val="24"/>
+              <w:szCs w:val="24"/>
+              <w:lang w:val="es-ES" w:eastAsia="es-ES"/>
+              <w14:ligatures w14:val="standardContextual"/>
+            </w:rPr>
+          </w:pPr>
+          <w:hyperlink w:anchor="_Toc243945376" w:history="1">
+            <w:r>
+              <w:rPr>
+                <w:rStyle w:val="Hipervnculo"/>
+                <w:noProof/>
+              </w:rPr>
+              <w:t>Generate Embeddings</w:t>
+            </w:r>
+            <w:r>
+              <w:rPr>
+                <w:noProof/>
+                <w:webHidden/>
+              </w:rPr>
+              <w:tab/>
+            </w:r>
+            <w:r>
+              <w:rPr>
+                <w:noProof/>
+                <w:webHidden/>
+              </w:rPr>
+              <w:fldChar w:fldCharType="begin"/>
+            </w:r>
+            <w:r>
+              <w:rPr>
+                <w:noProof/>
+                <w:webHidden/>
+              </w:rPr>
+              <w:instrText xml:space="preserve"> PAGEREF _Toc243945376 \h </w:instrText>
+            </w:r>
+            <w:r>
+              <w:rPr>
+                <w:noProof/>
+                <w:webHidden/>
+              </w:rPr>
+            </w:r>
+            <w:r>
+              <w:rPr>
+                <w:noProof/>
+                <w:webHidden/>
+              </w:rPr>
+              <w:fldChar w:fldCharType="separate"/>
+            </w:r>
+            <w:r>
+              <w:rPr>
+                <w:noProof/>
+                <w:webHidden/>
+              </w:rPr>
+              <w:t>20</w:t>
+            </w:r>
+            <w:r>
+              <w:rPr>
+                <w:noProof/>
+                <w:webHidden/>
+              </w:rPr>
+              <w:fldChar w:fldCharType="end"/>
+            </w:r>
+          </w:hyperlink>
+        </w:p>
+        <w:p>
+          <w:pPr>
+            <w:pStyle w:val="TDC2"/>
+            <w:tabs>
+              <w:tab w:val="right" w:leader="dot" w:pos="9350"/>
+            </w:tabs>
+            <w:rPr>
+              <w:rFonts w:eastAsiaTheme="minorEastAsia"/>
+              <w:noProof/>
+              <w:kern w:val="2"/>
+              <w:sz w:val="24"/>
+              <w:szCs w:val="24"/>
+              <w:lang w:val="es-ES" w:eastAsia="es-ES"/>
+              <w14:ligatures w14:val="standardContextual"/>
+            </w:rPr>
+          </w:pPr>
+          <w:hyperlink w:anchor="_Toc243945377" w:history="1">
+            <w:r>
+              <w:rPr>
+                <w:rStyle w:val="Hipervnculo"/>
+                <w:noProof/>
+              </w:rPr>
+              <w:t>Habilitar Hybrid Search</w:t>
+            </w:r>
+            <w:r>
+              <w:rPr>
+                <w:noProof/>
+                <w:webHidden/>
+              </w:rPr>
+              <w:tab/>
+            </w:r>
+            <w:r>
+              <w:rPr>
+                <w:noProof/>
+                <w:webHidden/>
+              </w:rPr>
+              <w:fldChar w:fldCharType="begin"/>
+            </w:r>
+            <w:r>
+              <w:rPr>
+                <w:noProof/>
+                <w:webHidden/>
+              </w:rPr>
+              <w:instrText xml:space="preserve"> PAGEREF _Toc243945377 \h </w:instrText>
+            </w:r>
+            <w:r>
+              <w:rPr>
+                <w:noProof/>
+                <w:webHidden/>
+              </w:rPr>
+            </w:r>
+            <w:r>
+              <w:rPr>
+                <w:noProof/>
+                <w:webHidden/>
+              </w:rPr>
+              <w:fldChar w:fldCharType="separate"/>
+            </w:r>
+            <w:r>
+              <w:rPr>
+                <w:noProof/>
+                <w:webHidden/>
+              </w:rPr>
+              <w:t>21</w:t>
+            </w:r>
+            <w:r>
+              <w:rPr>
+                <w:noProof/>
+                <w:webHidden/>
+              </w:rPr>
+              <w:fldChar w:fldCharType="end"/>
+            </w:r>
+          </w:hyperlink>
+        </w:p>
+        <w:p>
+          <w:pPr>
+            <w:pStyle w:val="TDC2"/>
+            <w:tabs>
+              <w:tab w:val="right" w:leader="dot" w:pos="9350"/>
+            </w:tabs>
+            <w:rPr>
+              <w:rFonts w:eastAsiaTheme="minorEastAsia"/>
+              <w:noProof/>
+              <w:kern w:val="2"/>
+              <w:sz w:val="24"/>
+              <w:szCs w:val="24"/>
+              <w:lang w:val="es-ES" w:eastAsia="es-ES"/>
+              <w14:ligatures w14:val="standardContextual"/>
+            </w:rPr>
+          </w:pPr>
+          <w:hyperlink w:anchor="_Toc243945378" w:history="1">
+            <w:r>
+              <w:rPr>
+                <w:rStyle w:val="Hipervnculo"/>
+                <w:noProof/>
+              </w:rPr>
+              <w:t>Probar Hybrid Search</w:t>
+            </w:r>
+            <w:r>
+              <w:rPr>
+                <w:noProof/>
+                <w:webHidden/>
+              </w:rPr>
+              <w:tab/>
+            </w:r>
+            <w:r>
+              <w:rPr>
+                <w:noProof/>
+                <w:webHidden/>
+              </w:rPr>
+              <w:fldChar w:fldCharType="begin"/>
+            </w:r>
+            <w:r>
+              <w:rPr>
+                <w:noProof/>
+                <w:webHidden/>
+              </w:rPr>
+              <w:instrText xml:space="preserve"> PAGEREF _Toc243945378 \h </w:instrText>
+            </w:r>
+            <w:r>
+              <w:rPr>
+                <w:noProof/>
+                <w:webHidden/>
+              </w:rPr>
+            </w:r>
+            <w:r>
+              <w:rPr>
+                <w:noProof/>
+                <w:webHidden/>
+              </w:rPr>
+              <w:fldChar w:fldCharType="separate"/>
+            </w:r>
+            <w:r>
+              <w:rPr>
+                <w:noProof/>
+                <w:webHidden/>
+              </w:rPr>
+              <w:t>22</w:t>
+            </w:r>
+            <w:r>
+              <w:rPr>
+                <w:noProof/>
+                <w:webHidden/>
+              </w:rPr>
+              <w:fldChar w:fldCharType="end"/>
+            </w:r>
+          </w:hyperlink>
+        </w:p>
+        <w:p>
+          <w:pPr>
+            <w:pStyle w:val="TDC2"/>
+            <w:tabs>
+              <w:tab w:val="right" w:leader="dot" w:pos="9350"/>
+            </w:tabs>
+            <w:rPr>
+              <w:rFonts w:eastAsiaTheme="minorEastAsia"/>
+              <w:noProof/>
+              <w:kern w:val="2"/>
+              <w:sz w:val="24"/>
+              <w:szCs w:val="24"/>
+              <w:lang w:val="es-ES" w:eastAsia="es-ES"/>
+              <w14:ligatures w14:val="standardContextual"/>
+            </w:rPr>
+          </w:pPr>
+          <w:hyperlink w:anchor="_Toc243945379" w:history="1">
+            <w:r>
+              <w:rPr>
+                <w:rStyle w:val="Hipervnculo"/>
+                <w:noProof/>
+              </w:rPr>
+              <w:t>Vector Index Error</w:t>
+            </w:r>
+            <w:r>
+              <w:rPr>
+                <w:noProof/>
+                <w:webHidden/>
+              </w:rPr>
+              <w:tab/>
+            </w:r>
+            <w:r>
+              <w:rPr>
+                <w:noProof/>
+                <w:webHidden/>
+              </w:rPr>
+              <w:fldChar w:fldCharType="begin"/>
+            </w:r>
+            <w:r>
+              <w:rPr>
+                <w:noProof/>
+                <w:webHidden/>
+              </w:rPr>
+              <w:instrText xml:space="preserve"> PAGEREF _Toc243945379 \h </w:instrText>
+            </w:r>
+            <w:r>
+              <w:rPr>
+                <w:noProof/>
+                <w:webHidden/>
+              </w:rPr>
+            </w:r>
+            <w:r>
+              <w:rPr>
+                <w:noProof/>
+                <w:webHidden/>
+              </w:rPr>
+              <w:fldChar w:fldCharType="separate"/>
+            </w:r>
+            <w:r>
+              <w:rPr>
+                <w:noProof/>
+                <w:webHidden/>
+              </w:rPr>
+              <w:t>23</w:t>
+            </w:r>
+            <w:r>
+              <w:rPr>
+                <w:noProof/>
+                <w:webHidden/>
+              </w:rPr>
+              <w:fldChar w:fldCharType="end"/>
+            </w:r>
+          </w:hyperlink>
+        </w:p>
+        <w:p>
+          <w:pPr>
+            <w:pStyle w:val="TDC1"/>
+            <w:tabs>
+              <w:tab w:val="right" w:leader="dot" w:pos="9350"/>
+            </w:tabs>
+            <w:rPr>
+              <w:rFonts w:eastAsiaTheme="minorEastAsia"/>
+              <w:noProof/>
+              <w:kern w:val="2"/>
+              <w:sz w:val="24"/>
+              <w:szCs w:val="24"/>
+              <w:lang w:val="es-ES" w:eastAsia="es-ES"/>
+              <w14:ligatures w14:val="standardContextual"/>
+            </w:rPr>
+          </w:pPr>
+          <w:hyperlink w:anchor="_Toc243945380" w:history="1">
+            <w:r>
+              <w:rPr>
+                <w:rStyle w:val="Hipervnculo"/>
+                <w:noProof/>
+              </w:rPr>
+              <w:t>RAG</w:t>
+            </w:r>
+            <w:r>
+              <w:rPr>
+                <w:noProof/>
+                <w:webHidden/>
+              </w:rPr>
+              <w:tab/>
+            </w:r>
+            <w:r>
+              <w:rPr>
+                <w:noProof/>
+                <w:webHidden/>
+              </w:rPr>
+              <w:fldChar w:fldCharType="begin"/>
+            </w:r>
+            <w:r>
+              <w:rPr>
+                <w:noProof/>
+                <w:webHidden/>
+              </w:rPr>
+              <w:instrText xml:space="preserve"> PAGEREF _Toc243945380 \h </w:instrText>
+            </w:r>
+            <w:r>
+              <w:rPr>
+                <w:noProof/>
+                <w:webHidden/>
+              </w:rPr>
+            </w:r>
+            <w:r>
+              <w:rPr>
+                <w:noProof/>
+                <w:webHidden/>
+              </w:rPr>
+              <w:fldChar w:fldCharType="separate"/>
+            </w:r>
+            <w:r>
+              <w:rPr>
+                <w:noProof/>
+                <w:webHidden/>
+              </w:rPr>
+              <w:t>24</w:t>
+            </w:r>
+            <w:r>
+              <w:rPr>
+                <w:noProof/>
+                <w:webHidden/>
+              </w:rPr>
+              <w:fldChar w:fldCharType="end"/>
+            </w:r>
+          </w:hyperlink>
+        </w:p>
+        <w:p>
+          <w:pPr>
+            <w:pStyle w:val="TDC2"/>
+            <w:tabs>
+              <w:tab w:val="right" w:leader="dot" w:pos="9350"/>
+            </w:tabs>
+            <w:rPr>
+              <w:rFonts w:eastAsiaTheme="minorEastAsia"/>
+              <w:noProof/>
+              <w:kern w:val="2"/>
+              <w:sz w:val="24"/>
+              <w:szCs w:val="24"/>
+              <w:lang w:val="es-ES" w:eastAsia="es-ES"/>
+              <w14:ligatures w14:val="standardContextual"/>
+            </w:rPr>
+          </w:pPr>
+          <w:hyperlink w:anchor="_Toc243945381" w:history="1">
+            <w:r>
+              <w:rPr>
+                <w:rStyle w:val="Hipervnculo"/>
+                <w:noProof/>
+              </w:rPr>
+              <w:t>Pruebas RAG</w:t>
+            </w:r>
+            <w:r>
+              <w:rPr>
+                <w:noProof/>
+                <w:webHidden/>
+              </w:rPr>
+              <w:tab/>
+            </w:r>
+            <w:r>
+              <w:rPr>
+                <w:noProof/>
+                <w:webHidden/>
+              </w:rPr>
+              <w:fldChar w:fldCharType="begin"/>
+            </w:r>
+            <w:r>
+              <w:rPr>
+                <w:noProof/>
+                <w:webHidden/>
+              </w:rPr>
+              <w:instrText xml:space="preserve"> PAGEREF _Toc243945381 \h </w:instrText>
+            </w:r>
+            <w:r>
+              <w:rPr>
+                <w:noProof/>
+                <w:webHidden/>
+              </w:rPr>
+            </w:r>
+            <w:r>
+              <w:rPr>
+                <w:noProof/>
+                <w:webHidden/>
+              </w:rPr>
+              <w:fldChar w:fldCharType="separate"/>
+            </w:r>
+            <w:r>
+              <w:rPr>
+                <w:noProof/>
+                <w:webHidden/>
+              </w:rPr>
+              <w:t>25</w:t>
             </w:r>
             <w:r>
               <w:rPr>
@@ -1659,13 +2459,13 @@
               <w14:ligatures w14:val="standardContextual"/>
             </w:rPr>
           </w:pPr>
-          <w:hyperlink w:anchor="_Toc243935313" w:history="1">
+          <w:hyperlink w:anchor="_Toc243945382" w:history="1">
             <w:r>
               <w:rPr>
                 <w:rStyle w:val="Hipervnculo"/>
                 <w:noProof/>
               </w:rPr>
-              <w:t>Preparar tabla de pruebas</w:t>
+              <w:t>Prueba 1</w:t>
             </w:r>
             <w:r>
               <w:rPr>
@@ -1686,7 +2486,7 @@
                 <w:noProof/>
                 <w:webHidden/>
               </w:rPr>
-              <w:instrText xml:space="preserve"> PAGEREF _Toc243935313 \h </w:instrText>
+              <w:instrText xml:space="preserve"> PAGEREF _Toc243945382 \h </w:instrText>
             </w:r>
             <w:r>
               <w:rPr>
@@ -1706,7 +2506,7 @@
                 <w:noProof/>
                 <w:webHidden/>
               </w:rPr>
-              <w:t>15</w:t>
+              <w:t>25</w:t>
             </w:r>
             <w:r>
               <w:rPr>
@@ -1733,13 +2533,13 @@
               <w14:ligatures w14:val="standardContextual"/>
             </w:rPr>
           </w:pPr>
-          <w:hyperlink w:anchor="_Toc243935314" w:history="1">
+          <w:hyperlink w:anchor="_Toc243945383" w:history="1">
             <w:r>
               <w:rPr>
                 <w:rStyle w:val="Hipervnculo"/>
                 <w:noProof/>
               </w:rPr>
-              <w:t>Búsqueda sin Optimizar</w:t>
+              <w:t>Prueba 2</w:t>
             </w:r>
             <w:r>
               <w:rPr>
@@ -1760,7 +2560,7 @@
                 <w:noProof/>
                 <w:webHidden/>
               </w:rPr>
-              <w:instrText xml:space="preserve"> PAGEREF _Toc243935314 \h </w:instrText>
+              <w:instrText xml:space="preserve"> PAGEREF _Toc243945383 \h </w:instrText>
             </w:r>
             <w:r>
               <w:rPr>
@@ -1780,7 +2580,7 @@
                 <w:noProof/>
                 <w:webHidden/>
               </w:rPr>
-              <w:t>16</w:t>
+              <w:t>25</w:t>
             </w:r>
             <w:r>
               <w:rPr>
@@ -1807,13 +2607,13 @@
               <w14:ligatures w14:val="standardContextual"/>
             </w:rPr>
           </w:pPr>
-          <w:hyperlink w:anchor="_Toc243935315" w:history="1">
+          <w:hyperlink w:anchor="_Toc243945384" w:history="1">
             <w:r>
               <w:rPr>
                 <w:rStyle w:val="Hipervnculo"/>
                 <w:noProof/>
               </w:rPr>
-              <w:t>Búsqueda Optimizada</w:t>
+              <w:t>Prueba 3</w:t>
             </w:r>
             <w:r>
               <w:rPr>
@@ -1834,7 +2634,7 @@
                 <w:noProof/>
                 <w:webHidden/>
               </w:rPr>
-              <w:instrText xml:space="preserve"> PAGEREF _Toc243935315 \h </w:instrText>
+              <w:instrText xml:space="preserve"> PAGEREF _Toc243945384 \h </w:instrText>
             </w:r>
             <w:r>
               <w:rPr>
@@ -1854,7 +2654,7 @@
                 <w:noProof/>
                 <w:webHidden/>
               </w:rPr>
-              <w:t>17</w:t>
+              <w:t>26</w:t>
             </w:r>
             <w:r>
               <w:rPr>
@@ -1881,13 +2681,13 @@
               <w14:ligatures w14:val="standardContextual"/>
             </w:rPr>
           </w:pPr>
-          <w:hyperlink w:anchor="_Toc243935316" w:history="1">
+          <w:hyperlink w:anchor="_Toc243945385" w:history="1">
             <w:r>
               <w:rPr>
                 <w:rStyle w:val="Hipervnculo"/>
                 <w:noProof/>
               </w:rPr>
-              <w:t>Modelos, embeddings y búsqueda inteligente</w:t>
+              <w:t>Test Final</w:t>
             </w:r>
             <w:r>
               <w:rPr>
@@ -1908,7 +2708,7 @@
                 <w:noProof/>
                 <w:webHidden/>
               </w:rPr>
-              <w:instrText xml:space="preserve"> PAGEREF _Toc243935316 \h </w:instrText>
+              <w:instrText xml:space="preserve"> PAGEREF _Toc243945385 \h </w:instrText>
             </w:r>
             <w:r>
               <w:rPr>
@@ -1928,7 +2728,7 @@
                 <w:noProof/>
                 <w:webHidden/>
               </w:rPr>
-              <w:t>18</w:t>
+              <w:t>26</w:t>
             </w:r>
             <w:r>
               <w:rPr>
@@ -1959,7 +2759,7 @@
       <w:pPr>
         <w:pStyle w:val="Ttulo1"/>
       </w:pPr>
-      <w:bookmarkStart w:id="0" w:name="_Toc243935292"/>
+      <w:bookmarkStart w:id="0" w:name="_Toc243945350"/>
       <w:r>
         <w:t>Objetivo</w:t>
       </w:r>
@@ -2004,7 +2804,7 @@
       <w:pPr>
         <w:pStyle w:val="Ttulo1"/>
       </w:pPr>
-      <w:bookmarkStart w:id="1" w:name="_Toc243935293"/>
+      <w:bookmarkStart w:id="1" w:name="_Toc243945351"/>
       <w:r>
         <w:t>Requisitos</w:t>
       </w:r>
@@ -2165,7 +2965,7 @@
       <w:pPr>
         <w:pStyle w:val="Ttulo1"/>
       </w:pPr>
-      <w:bookmarkStart w:id="2" w:name="_Toc243935294"/>
+      <w:bookmarkStart w:id="2" w:name="_Toc243945352"/>
       <w:r>
         <w:t>Instala</w:t>
       </w:r>
@@ -2178,7 +2978,7 @@
       <w:pPr>
         <w:pStyle w:val="Ttulo2"/>
       </w:pPr>
-      <w:bookmarkStart w:id="3" w:name="_Toc243935295"/>
+      <w:bookmarkStart w:id="3" w:name="_Toc243945353"/>
       <w:r>
         <w:t>Instalar zip de GitHub</w:t>
       </w:r>
@@ -2246,7 +3046,7 @@
       <w:pPr>
         <w:pStyle w:val="Ttulo2"/>
       </w:pPr>
-      <w:bookmarkStart w:id="4" w:name="_Toc243935296"/>
+      <w:bookmarkStart w:id="4" w:name="_Toc243945354"/>
       <w:r>
         <w:t>Iniciar Ollama e Instalar Modelos</w:t>
       </w:r>
@@ -2298,7 +3098,7 @@
       <w:pPr>
         <w:pStyle w:val="Ttulo3"/>
       </w:pPr>
-      <w:bookmarkStart w:id="5" w:name="_Toc243935297"/>
+      <w:bookmarkStart w:id="5" w:name="_Toc243945355"/>
       <w:r>
         <w:t>Ollama Iniciado</w:t>
       </w:r>
@@ -2353,7 +3153,7 @@
       <w:pPr>
         <w:pStyle w:val="Ttulo3"/>
       </w:pPr>
-      <w:bookmarkStart w:id="6" w:name="_Toc243935298"/>
+      <w:bookmarkStart w:id="6" w:name="_Toc243945356"/>
       <w:r>
         <w:t>Pruebas con Ollama</w:t>
       </w:r>
@@ -2405,7 +3205,7 @@
       <w:pPr>
         <w:pStyle w:val="Ttulo2"/>
       </w:pPr>
-      <w:bookmarkStart w:id="7" w:name="_Toc243935299"/>
+      <w:bookmarkStart w:id="7" w:name="_Toc243945357"/>
       <w:r>
         <w:t>Instalar Caddy</w:t>
       </w:r>
@@ -2462,7 +3262,7 @@
       <w:pPr>
         <w:pStyle w:val="Ttulo2"/>
       </w:pPr>
-      <w:bookmarkStart w:id="8" w:name="_Toc243935300"/>
+      <w:bookmarkStart w:id="8" w:name="_Toc243945358"/>
       <w:r>
         <w:t xml:space="preserve">Desbloquear Caddy y Crear </w:t>
       </w:r>
@@ -2519,7 +3319,7 @@
       <w:pPr>
         <w:pStyle w:val="Ttulo2"/>
       </w:pPr>
-      <w:bookmarkStart w:id="9" w:name="_Toc243935301"/>
+      <w:bookmarkStart w:id="9" w:name="_Toc243945359"/>
       <w:r>
         <w:t>Ventana de Logs</w:t>
       </w:r>
@@ -2571,7 +3371,7 @@
       <w:pPr>
         <w:pStyle w:val="Ttulo2"/>
       </w:pPr>
-      <w:bookmarkStart w:id="10" w:name="_Toc243935302"/>
+      <w:bookmarkStart w:id="10" w:name="_Toc243945360"/>
       <w:r>
         <w:t>Hacer que MSSQLSERVER confíe en Caddy.</w:t>
       </w:r>
@@ -2623,7 +3423,7 @@
       <w:pPr>
         <w:pStyle w:val="Ttulo1"/>
       </w:pPr>
-      <w:bookmarkStart w:id="11" w:name="_Toc243935303"/>
+      <w:bookmarkStart w:id="11" w:name="_Toc243945361"/>
       <w:r>
         <w:t>Pasos para Iniciar</w:t>
       </w:r>
@@ -2822,7 +3622,7 @@
       <w:pPr>
         <w:pStyle w:val="Ttulo1"/>
       </w:pPr>
-      <w:bookmarkStart w:id="12" w:name="_Toc243935304"/>
+      <w:bookmarkStart w:id="12" w:name="_Toc243945362"/>
       <w:r>
         <w:t>Bases de Datos</w:t>
       </w:r>
@@ -2832,7 +3632,7 @@
       <w:pPr>
         <w:pStyle w:val="Ttulo2"/>
       </w:pPr>
-      <w:bookmarkStart w:id="13" w:name="_Toc243935305"/>
+      <w:bookmarkStart w:id="13" w:name="_Toc243945363"/>
       <w:proofErr w:type="spellStart"/>
       <w:r>
         <w:t>Create</w:t>
@@ -2889,7 +3689,7 @@
       <w:pPr>
         <w:pStyle w:val="Ttulo2"/>
       </w:pPr>
-      <w:bookmarkStart w:id="14" w:name="_Toc243935306"/>
+      <w:bookmarkStart w:id="14" w:name="_Toc243945364"/>
       <w:proofErr w:type="spellStart"/>
       <w:r>
         <w:t>Create</w:t>
@@ -2946,7 +3746,7 @@
       <w:pPr>
         <w:pStyle w:val="Ttulo2"/>
       </w:pPr>
-      <w:bookmarkStart w:id="15" w:name="_Toc243935307"/>
+      <w:bookmarkStart w:id="15" w:name="_Toc243945365"/>
       <w:proofErr w:type="spellStart"/>
       <w:r>
         <w:t>Insert</w:t>
@@ -3003,7 +3803,7 @@
       <w:pPr>
         <w:pStyle w:val="Ttulo2"/>
       </w:pPr>
-      <w:bookmarkStart w:id="16" w:name="_Toc243935308"/>
+      <w:bookmarkStart w:id="16" w:name="_Toc243945366"/>
       <w:proofErr w:type="spellStart"/>
       <w:r>
         <w:t>Programming</w:t>
@@ -3065,7 +3865,7 @@
       <w:pPr>
         <w:pStyle w:val="Ttulo2"/>
       </w:pPr>
-      <w:bookmarkStart w:id="17" w:name="_Toc243935309"/>
+      <w:bookmarkStart w:id="17" w:name="_Toc243945367"/>
       <w:proofErr w:type="spellStart"/>
       <w:r>
         <w:t>Advanced</w:t>
@@ -3135,7 +3935,7 @@
       <w:pPr>
         <w:pStyle w:val="Ttulo2"/>
       </w:pPr>
-      <w:bookmarkStart w:id="18" w:name="_Toc243935310"/>
+      <w:bookmarkStart w:id="18" w:name="_Toc243945368"/>
       <w:r>
         <w:t>Security</w:t>
       </w:r>
@@ -3187,7 +3987,7 @@
       <w:pPr>
         <w:pStyle w:val="Ttulo3"/>
       </w:pPr>
-      <w:bookmarkStart w:id="19" w:name="_Toc243935311"/>
+      <w:bookmarkStart w:id="19" w:name="_Toc243945369"/>
       <w:r>
         <w:t>Security Test</w:t>
       </w:r>
@@ -3239,7 +4039,7 @@
       <w:pPr>
         <w:pStyle w:val="Ttulo1"/>
       </w:pPr>
-      <w:bookmarkStart w:id="20" w:name="_Toc243935312"/>
+      <w:bookmarkStart w:id="20" w:name="_Toc243945370"/>
       <w:proofErr w:type="spellStart"/>
       <w:r>
         <w:t>Index</w:t>
@@ -3259,7 +4059,7 @@
       <w:pPr>
         <w:pStyle w:val="Ttulo2"/>
       </w:pPr>
-      <w:bookmarkStart w:id="21" w:name="_Toc243935313"/>
+      <w:bookmarkStart w:id="21" w:name="_Toc243945371"/>
       <w:r>
         <w:t>Preparar tabla de pruebas</w:t>
       </w:r>
@@ -3317,7 +4117,7 @@
       <w:pPr>
         <w:pStyle w:val="Ttulo2"/>
       </w:pPr>
-      <w:bookmarkStart w:id="22" w:name="_Toc243935314"/>
+      <w:bookmarkStart w:id="22" w:name="_Toc243945372"/>
       <w:r>
         <w:t>Búsqueda sin Optimizar</w:t>
       </w:r>
@@ -3409,7 +4209,7 @@
       <w:pPr>
         <w:pStyle w:val="Ttulo2"/>
       </w:pPr>
-      <w:bookmarkStart w:id="23" w:name="_Toc243935315"/>
+      <w:bookmarkStart w:id="23" w:name="_Toc243945373"/>
       <w:r>
         <w:t>Búsqueda Optimizada</w:t>
       </w:r>
@@ -3461,7 +4261,7 @@
       <w:pPr>
         <w:pStyle w:val="Ttulo1"/>
       </w:pPr>
-      <w:bookmarkStart w:id="24" w:name="_Toc243935316"/>
+      <w:bookmarkStart w:id="24" w:name="_Toc243945374"/>
       <w:r>
         <w:t xml:space="preserve">Modelos, </w:t>
       </w:r>
@@ -3479,12 +4279,17 @@
       <w:pPr>
         <w:pStyle w:val="Ttulo2"/>
       </w:pPr>
+      <w:bookmarkStart w:id="25" w:name="_Toc243945375"/>
       <w:r>
         <w:t>Conectar SQL Server con el modelo</w:t>
       </w:r>
-    </w:p>
-    <w:p>
-      <w:r>
+      <w:bookmarkEnd w:id="25"/>
+    </w:p>
+    <w:p>
+      <w:r>
+        <w:rPr>
+          <w:noProof/>
+        </w:rPr>
         <w:drawing>
           <wp:inline distT="0" distB="0" distL="0" distR="0" wp14:anchorId="67C9192D" wp14:editId="0DC0D790">
             <wp:extent cx="5943600" cy="4413250"/>
@@ -3522,6 +4327,9 @@
         </w:drawing>
       </w:r>
       <w:r>
+        <w:rPr>
+          <w:noProof/>
+        </w:rPr>
         <w:drawing>
           <wp:inline distT="0" distB="0" distL="0" distR="0" wp14:anchorId="7BACAFE5" wp14:editId="11803472">
             <wp:extent cx="5943600" cy="1195070"/>
@@ -3563,6 +4371,7 @@
       <w:pPr>
         <w:pStyle w:val="Ttulo2"/>
       </w:pPr>
+      <w:bookmarkStart w:id="26" w:name="_Toc243945376"/>
       <w:proofErr w:type="spellStart"/>
       <w:r>
         <w:t>Generate</w:t>
@@ -3575,10 +4384,14 @@
       <w:r>
         <w:t>Embeddings</w:t>
       </w:r>
+      <w:bookmarkEnd w:id="26"/>
       <w:proofErr w:type="spellEnd"/>
     </w:p>
     <w:p>
       <w:r>
+        <w:rPr>
+          <w:noProof/>
+        </w:rPr>
         <w:drawing>
           <wp:inline distT="0" distB="0" distL="0" distR="0" wp14:anchorId="2B5BB1B1" wp14:editId="1A3213C2">
             <wp:extent cx="5943600" cy="4274185"/>
@@ -3620,15 +4433,20 @@
       <w:pPr>
         <w:pStyle w:val="Ttulo2"/>
       </w:pPr>
+      <w:bookmarkStart w:id="27" w:name="_Toc243945377"/>
       <w:r>
         <w:t xml:space="preserve">Habilitar </w:t>
       </w:r>
       <w:r>
         <w:t>Hybrid Search</w:t>
       </w:r>
-    </w:p>
-    <w:p>
-      <w:r>
+      <w:bookmarkEnd w:id="27"/>
+    </w:p>
+    <w:p>
+      <w:r>
+        <w:rPr>
+          <w:noProof/>
+        </w:rPr>
         <w:drawing>
           <wp:inline distT="0" distB="0" distL="0" distR="0" wp14:anchorId="0DFEF216" wp14:editId="2F5720BA">
             <wp:extent cx="5943600" cy="4352925"/>
@@ -3670,12 +4488,17 @@
       <w:pPr>
         <w:pStyle w:val="Ttulo2"/>
       </w:pPr>
+      <w:bookmarkStart w:id="28" w:name="_Toc243945378"/>
       <w:r>
         <w:t>Probar Hybrid Search</w:t>
       </w:r>
-    </w:p>
-    <w:p>
-      <w:r>
+      <w:bookmarkEnd w:id="28"/>
+    </w:p>
+    <w:p>
+      <w:r>
+        <w:rPr>
+          <w:noProof/>
+        </w:rPr>
         <w:drawing>
           <wp:inline distT="0" distB="0" distL="0" distR="0" wp14:anchorId="612114A9" wp14:editId="4A729052">
             <wp:extent cx="5943600" cy="4391660"/>
@@ -3717,6 +4540,7 @@
       <w:pPr>
         <w:pStyle w:val="Ttulo2"/>
       </w:pPr>
+      <w:bookmarkStart w:id="29" w:name="_Toc243945379"/>
       <w:r>
         <w:t xml:space="preserve">Vector </w:t>
       </w:r>
@@ -3728,9 +4552,13 @@
       <w:r>
         <w:t xml:space="preserve"> Error</w:t>
       </w:r>
-    </w:p>
-    <w:p>
-      <w:r>
+      <w:bookmarkEnd w:id="29"/>
+    </w:p>
+    <w:p>
+      <w:r>
+        <w:rPr>
+          <w:noProof/>
+        </w:rPr>
         <w:drawing>
           <wp:inline distT="0" distB="0" distL="0" distR="0" wp14:anchorId="6038660D" wp14:editId="341E08B8">
             <wp:extent cx="5943600" cy="3649345"/>
@@ -3772,9 +4600,11 @@
       <w:pPr>
         <w:pStyle w:val="Ttulo1"/>
       </w:pPr>
+      <w:bookmarkStart w:id="30" w:name="_Toc243945380"/>
       <w:r>
         <w:t>RAG</w:t>
       </w:r>
+      <w:bookmarkEnd w:id="30"/>
     </w:p>
     <w:p>
       <w:r>
@@ -3828,20 +4658,27 @@
       <w:pPr>
         <w:pStyle w:val="Ttulo2"/>
       </w:pPr>
+      <w:bookmarkStart w:id="31" w:name="_Toc243945381"/>
       <w:r>
         <w:t>Pruebas RAG</w:t>
       </w:r>
+      <w:bookmarkEnd w:id="31"/>
     </w:p>
     <w:p>
       <w:pPr>
         <w:pStyle w:val="Ttulo3"/>
       </w:pPr>
+      <w:bookmarkStart w:id="32" w:name="_Toc243945382"/>
       <w:r>
         <w:t>Prueba 1</w:t>
       </w:r>
-    </w:p>
-    <w:p>
-      <w:r>
+      <w:bookmarkEnd w:id="32"/>
+    </w:p>
+    <w:p>
+      <w:r>
+        <w:rPr>
+          <w:noProof/>
+        </w:rPr>
         <w:drawing>
           <wp:inline distT="0" distB="0" distL="0" distR="0" wp14:anchorId="6CBE8038" wp14:editId="257CF9F5">
             <wp:extent cx="5943600" cy="3144520"/>
@@ -3883,12 +4720,17 @@
       <w:pPr>
         <w:pStyle w:val="Ttulo3"/>
       </w:pPr>
+      <w:bookmarkStart w:id="33" w:name="_Toc243945383"/>
       <w:r>
         <w:t>Prueba 2</w:t>
       </w:r>
-    </w:p>
-    <w:p>
-      <w:r>
+      <w:bookmarkEnd w:id="33"/>
+    </w:p>
+    <w:p>
+      <w:r>
+        <w:rPr>
+          <w:noProof/>
+        </w:rPr>
         <w:drawing>
           <wp:inline distT="0" distB="0" distL="0" distR="0" wp14:anchorId="719476D1" wp14:editId="3B75C131">
             <wp:extent cx="5943600" cy="1757680"/>
@@ -3930,12 +4772,17 @@
       <w:pPr>
         <w:pStyle w:val="Ttulo3"/>
       </w:pPr>
+      <w:bookmarkStart w:id="34" w:name="_Toc243945384"/>
       <w:r>
         <w:t>Prueba 3</w:t>
       </w:r>
-    </w:p>
-    <w:p>
-      <w:r>
+      <w:bookmarkEnd w:id="34"/>
+    </w:p>
+    <w:p>
+      <w:r>
+        <w:rPr>
+          <w:noProof/>
+        </w:rPr>
         <w:drawing>
           <wp:inline distT="0" distB="0" distL="0" distR="0" wp14:anchorId="21BFAE07" wp14:editId="4E61A50A">
             <wp:extent cx="5943600" cy="2050415"/>
@@ -3977,9 +4824,11 @@
       <w:pPr>
         <w:pStyle w:val="Ttulo1"/>
       </w:pPr>
+      <w:bookmarkStart w:id="35" w:name="_Toc243945385"/>
       <w:r>
         <w:t>Test Final</w:t>
       </w:r>
+      <w:bookmarkEnd w:id="35"/>
     </w:p>
     <w:p>
       <w:pPr>
@@ -3989,6 +4838,9 @@
         </w:rPr>
       </w:pPr>
       <w:r>
+        <w:rPr>
+          <w:noProof/>
+        </w:rPr>
         <w:drawing>
           <wp:inline distT="0" distB="0" distL="0" distR="0" wp14:anchorId="4AAFABD1" wp14:editId="718FB2DF">
             <wp:extent cx="5943600" cy="4435475"/>

</xml_diff>